<commit_message>
chore: alinea documentacion y depura archivos internos
</commit_message>
<xml_diff>
--- a/docs/informe_final/Capitulo_Granulometria_Informe_Final.docx
+++ b/docs/informe_final/Capitulo_Granulometria_Informe_Final.docx
@@ -219,11 +219,9 @@
         <w:rPr>
           <w:b/>
         </w:rPr>
-        <w:t xml:space="preserve">OE5. </w:t>
+        <w:t>OE5. Evaluar el comportamiento del sistema en un conjunto técnico sin coincidencias exactas de frames respecto de los datos de desarrollo, identificar sus errores dominantes y establecer las condiciones necesarias para avanzar hacia una validación operacional por video o camión completo.</w:t>
       </w:r>
-      <w:r>
-        <w:t>Evaluar el comportamiento del sistema en un conjunto técnico independiente, identificar sus errores dominantes y establecer las condiciones necesarias para avanzar hacia una validación operacional.</w:t>
-      </w:r>
+      <w:r/>
     </w:p>
     <w:p>
       <w:pPr>
@@ -6517,7 +6515,7 @@
         <w:keepLines w:val="0"/>
       </w:pPr>
       <w:r>
-        <w:t>A nivel de imagen completa, la prueba técnica incorpora todas las etapas del pipeline y compara la clase dominante del resultado con una referencia visual independiente. Finalmente, la demostración sobre video comprueba la extracción temporal, la persistencia de resultados y la agregación de múltiples frames pertenecientes al mismo camión.</w:t>
+        <w:t>A nivel de imagen completa, la prueba técnica incorpora todas las etapas del pipeline y compara la clase dominante del resultado con una referencia visual asignada a cada frame. Finalmente, la demostración sobre video comprueba la extracción temporal, la persistencia de resultados y la agregación de múltiples frames pertenecientes al mismo camión.</w:t>
       </w:r>
     </w:p>
     <w:p>
@@ -10415,7 +10413,7 @@
         <w:keepLines w:val="0"/>
       </w:pPr>
       <w:r>
-        <w:t>La prueba técnica utiliza 90 frames adicionales, organizados en tres grupos balanceados de 30 imágenes cuya carga se selecciona visualmente como mayoritariamente fina, media o gruesa. La carpeta de origen actúa como referencia de clase dominante. No existen coincidencias exactas de nombre con los frames de entrenamiento, validación o prueba interna. Todas las imágenes resultan evaluables por el pipeline.</w:t>
+        <w:t>La prueba técnica utiliza 90 frames adicionales, organizados en tres grupos balanceados de 30 imágenes cuya carga se selecciona visualmente como mayoritariamente fina, media o gruesa. La carpeta de origen actúa como referencia de clase dominante. No existen coincidencias exactas de nombre con los frames de entrenamiento, validación o prueba interna; sin embargo, esta comprobación no demuestra independencia por video o camión, ya que frames de una misma secuencia pueden permanecer correlacionados. Todas las imágenes resultan evaluables por el pipeline.</w:t>
       </w:r>
     </w:p>
     <w:p>
@@ -14602,7 +14600,7 @@
         <w:keepLines w:val="0"/>
       </w:pPr>
       <w:r>
-        <w:t>La tercera línea busca completar la comparación de modelos bajo un mismo conjunto de datos y particiones. Además de la línea base OpenCV + Random Forest y la CNN RGB ya evaluadas, se deben probar DexiNed + Random Forest/SVM, una CNN basada en escala de grises o mapas de bordes y una CNN multimodal que combine RGB con DexiNed. El detector de rocas sobredimensionadas puede incorporarse como una señal complementaria e independiente de la composición granulométrica general.</w:t>
+        <w:t>La tercera línea busca completar la comparación de modelos bajo un mismo conjunto de datos y particiones. Además de la línea base OpenCV + Random Forest y la CNN RGB ya evaluadas, se deben probar DexiNed + Random Forest/SVM, una CNN basada en escala de grises o mapas de bordes y una CNN multimodal que combine RGB con DexiNed.</w:t>
       </w:r>
     </w:p>
     <w:p>

</xml_diff>